<commit_message>
Label required data and images explicitly for each step
Add dedicated 【必存数据】 and 【必存图片】 numbered lists with
filenames and descriptions for all 65 execution steps.

Co-authored-by: 9997433-bit <9997433-bit@users.noreply.github.com>
</commit_message>
<xml_diff>
--- a/download/直驱三轴龙门动态模型确认_逐步执行总表.docx
+++ b/download/直驱三轴龙门动态模型确认_逐步执行总表.docx
@@ -19,7 +19,7 @@
     <w:p>
       <w:pPr/>
       <w:r>
-        <w:t>本文档按执行顺序列出从实验前准备到论文撰写的全部步骤。英文术语在中文后用括号备注；不写工期，只写步骤顺序。与旧版表格版不同，本版以文字叙述为主：每一步说明做什么、为什么做、注意什么、可能风险、常见遗漏与易错点，并明确必存数据与图片。非必要不使用表格，便于开题后打印携带与实验现场查阅。</w:t>
+        <w:t>本文档按执行顺序列出从实验前准备到论文撰写的全部步骤。英文术语在中文后用括号备注；不写工期，只写步骤顺序。每一步结构为：文字说明 → 【必存数据】（编号列表，含文件名与用途）→ 【必存图片】（编号列表，含拍摄/导出要求）→ 现场操作要点。非必要不使用表格，便于开题后打印携带与实验现场查阅。</w:t>
       </w:r>
     </w:p>
     <w:p>
@@ -65,6 +65,40 @@
     <w:p>
       <w:pPr/>
       <w:r>
+        <w:t>【必存数据】（本步完成后必须存档的文件/文件夹，命名保持一致）</w:t>
+      </w:r>
+    </w:p>
+    <w:p>
+      <w:pPr>
+        <w:pStyle w:val="ListNumber"/>
+      </w:pPr>
+      <w:r>
+        <w:t>Experiment_Matrix.xlsx — 实验矩阵总表（实验编号、日期、轴位、激励、操作者、raw 路径、备份路径、封存状态）</w:t>
+      </w:r>
+    </w:p>
+    <w:p>
+      <w:pPr>
+        <w:pStyle w:val="ListNumber"/>
+      </w:pPr>
+      <w:r>
+        <w:t>01_Admin/ — 管理类文件根目录（矩阵、预约、安全告知等）</w:t>
+      </w:r>
+    </w:p>
+    <w:p>
+      <w:pPr/>
+      <w:r>
+        <w:t>【必存图片】（本步必须拍摄或导出的图，用于论文/答辩/追溯）</w:t>
+      </w:r>
+    </w:p>
+    <w:p>
+      <w:pPr/>
+      <w:r>
+        <w:t>本步无专用图片要求。</w:t>
+      </w:r>
+    </w:p>
+    <w:p>
+      <w:pPr/>
+      <w:r>
         <w:t>现场操作要点（逐项打勾）：</w:t>
       </w:r>
     </w:p>
@@ -121,6 +155,34 @@
     <w:p>
       <w:pPr/>
       <w:r>
+        <w:t>【必存数据】（本步完成后必须存档的文件/文件夹，命名保持一致）</w:t>
+      </w:r>
+    </w:p>
+    <w:p>
+      <w:pPr>
+        <w:pStyle w:val="ListNumber"/>
+      </w:pPr>
+      <w:r>
+        <w:t>P10-P12_PreRegistration.pdf — 盲验三点坐标、类型、实物标记方式、导师签字页</w:t>
+      </w:r>
+    </w:p>
+    <w:p>
+      <w:pPr/>
+      <w:r>
+        <w:t>【必存图片】（本步必须拍摄或导出的图，用于论文/答辩/追溯）</w:t>
+      </w:r>
+    </w:p>
+    <w:p>
+      <w:pPr>
+        <w:pStyle w:val="ListNumber"/>
+      </w:pPr>
+      <w:r>
+        <w:t>P10-P12_Marker_Photo.jpg — 盲验点实物标记照（可见编号与贴点位置）</w:t>
+      </w:r>
+    </w:p>
+    <w:p>
+      <w:pPr/>
+      <w:r>
         <w:t>现场操作要点（逐项打勾）：</w:t>
       </w:r>
     </w:p>
@@ -177,6 +239,42 @@
     <w:p>
       <w:pPr/>
       <w:r>
+        <w:t>【必存数据】（本步完成后必须存档的文件/文件夹，命名保持一致）</w:t>
+      </w:r>
+    </w:p>
+    <w:p>
+      <w:pPr>
+        <w:pStyle w:val="ListNumber"/>
+      </w:pPr>
+      <w:r>
+        <w:t>SSS_Definition.pdf — 标准状态定义（轴位、伺服、主轴、风机、拖链、地脚等）</w:t>
+      </w:r>
+    </w:p>
+    <w:p>
+      <w:pPr>
+        <w:pStyle w:val="ListNumber"/>
+      </w:pPr>
+      <w:r>
+        <w:t>SSS_Checklist.pdf — 每次实验前核对用检查表（可打印打勾）</w:t>
+      </w:r>
+    </w:p>
+    <w:p>
+      <w:pPr/>
+      <w:r>
+        <w:t>【必存图片】（本步必须拍摄或导出的图，用于论文/答辩/追溯）</w:t>
+      </w:r>
+    </w:p>
+    <w:p>
+      <w:pPr>
+        <w:pStyle w:val="ListNumber"/>
+      </w:pPr>
+      <w:r>
+        <w:t>SSS_Overview.png — SSS 状态示意图（标注轴位、拖链、关键辅机）</w:t>
+      </w:r>
+    </w:p>
+    <w:p>
+      <w:pPr/>
+      <w:r>
         <w:t>现场操作要点（逐项打勾）：</w:t>
       </w:r>
     </w:p>
@@ -233,6 +331,34 @@
     <w:p>
       <w:pPr/>
       <w:r>
+        <w:t>【必存数据】（本步完成后必须存档的文件/文件夹，命名保持一致）</w:t>
+      </w:r>
+    </w:p>
+    <w:p>
+      <w:pPr>
+        <w:pStyle w:val="ListNumber"/>
+      </w:pPr>
+      <w:r>
+        <w:t>MAC_Calculation_Protocol.pdf — 法向投影公式、归一化、阈值、版本号</w:t>
+      </w:r>
+    </w:p>
+    <w:p>
+      <w:pPr/>
+      <w:r>
+        <w:t>【必存图片】（本步必须拍摄或导出的图，用于论文/答辩/追溯）</w:t>
+      </w:r>
+    </w:p>
+    <w:p>
+      <w:pPr>
+        <w:pStyle w:val="ListNumber"/>
+      </w:pPr>
+      <w:r>
+        <w:t>MAC_Normal_Projection.png — 法向投影示意（可选但建议存）</w:t>
+      </w:r>
+    </w:p>
+    <w:p>
+      <w:pPr/>
+      <w:r>
         <w:t>现场操作要点（逐项打勾）：</w:t>
       </w:r>
     </w:p>
@@ -289,6 +415,32 @@
     <w:p>
       <w:pPr/>
       <w:r>
+        <w:t>【必存数据】（本步完成后必须存档的文件/文件夹，命名保持一致）</w:t>
+      </w:r>
+    </w:p>
+    <w:p>
+      <w:pPr>
+        <w:pStyle w:val="ListNumber"/>
+      </w:pPr>
+      <w:r>
+        <w:t>Trial_Selection_Rule.pdf — Trial 1–3 选用与异常 trial 剔除规则</w:t>
+      </w:r>
+    </w:p>
+    <w:p>
+      <w:pPr/>
+      <w:r>
+        <w:t>【必存图片】（本步必须拍摄或导出的图，用于论文/答辩/追溯）</w:t>
+      </w:r>
+    </w:p>
+    <w:p>
+      <w:pPr/>
+      <w:r>
+        <w:t>本步无专用图片要求。</w:t>
+      </w:r>
+    </w:p>
+    <w:p>
+      <w:pPr/>
+      <w:r>
         <w:t>现场操作要点（逐项打勾）：</w:t>
       </w:r>
     </w:p>
@@ -345,6 +497,34 @@
     <w:p>
       <w:pPr/>
       <w:r>
+        <w:t>【必存数据】（本步完成后必须存档的文件/文件夹，命名保持一致）</w:t>
+      </w:r>
+    </w:p>
+    <w:p>
+      <w:pPr>
+        <w:pStyle w:val="ListNumber"/>
+      </w:pPr>
+      <w:r>
+        <w:t>Coordinate_Transform.pdf — 机床/CAD/FE/SLDV 四套坐标变换关系与验证记录</w:t>
+      </w:r>
+    </w:p>
+    <w:p>
+      <w:pPr/>
+      <w:r>
+        <w:t>【必存图片】（本步必须拍摄或导出的图，用于论文/答辩/追溯）</w:t>
+      </w:r>
+    </w:p>
+    <w:p>
+      <w:pPr>
+        <w:pStyle w:val="ListNumber"/>
+      </w:pPr>
+      <w:r>
+        <w:t>Coordinate_Systems.png — 坐标系关系示意图（原点、轴向）</w:t>
+      </w:r>
+    </w:p>
+    <w:p>
+      <w:pPr/>
+      <w:r>
         <w:t>现场操作要点（逐项打勾）：</w:t>
       </w:r>
     </w:p>
@@ -401,6 +581,34 @@
     <w:p>
       <w:pPr/>
       <w:r>
+        <w:t>【必存数据】（本步完成后必须存档的文件/文件夹，命名保持一致）</w:t>
+      </w:r>
+    </w:p>
+    <w:p>
+      <w:pPr>
+        <w:pStyle w:val="ListNumber"/>
+      </w:pPr>
+      <w:r>
+        <w:t>Mode_Screening_Rules.docx — 12 阶提取、6 阶弹性模态筛选与剔除判据</w:t>
+      </w:r>
+    </w:p>
+    <w:p>
+      <w:pPr/>
+      <w:r>
+        <w:t>【必存图片】（本步必须拍摄或导出的图，用于论文/答辩/追溯）</w:t>
+      </w:r>
+    </w:p>
+    <w:p>
+      <w:pPr>
+        <w:pStyle w:val="ListNumber"/>
+      </w:pPr>
+      <w:r>
+        <w:t>Mode_Screening_Example.png — 被剔除模态 vs 保留模态振型对比示例</w:t>
+      </w:r>
+    </w:p>
+    <w:p>
+      <w:pPr/>
+      <w:r>
         <w:t>现场操作要点（逐项打勾）：</w:t>
       </w:r>
     </w:p>
@@ -457,6 +665,32 @@
     <w:p>
       <w:pPr/>
       <w:r>
+        <w:t>【必存数据】（本步完成后必须存档的文件/文件夹，命名保持一致）</w:t>
+      </w:r>
+    </w:p>
+    <w:p>
+      <w:pPr>
+        <w:pStyle w:val="ListNumber"/>
+      </w:pPr>
+      <w:r>
+        <w:t>Booking_Record.pdf — 机床/SLDV/B4 备用时段预约记录（邮件或系统截图）</w:t>
+      </w:r>
+    </w:p>
+    <w:p>
+      <w:pPr/>
+      <w:r>
+        <w:t>【必存图片】（本步必须拍摄或导出的图，用于论文/答辩/追溯）</w:t>
+      </w:r>
+    </w:p>
+    <w:p>
+      <w:pPr/>
+      <w:r>
+        <w:t>本步无专用图片要求。</w:t>
+      </w:r>
+    </w:p>
+    <w:p>
+      <w:pPr/>
+      <w:r>
         <w:t>现场操作要点（逐项打勾）：</w:t>
       </w:r>
     </w:p>
@@ -513,6 +747,40 @@
     <w:p>
       <w:pPr/>
       <w:r>
+        <w:t>【必存数据】（本步完成后必须存档的文件/文件夹，命名保持一致）</w:t>
+      </w:r>
+    </w:p>
+    <w:p>
+      <w:pPr>
+        <w:pStyle w:val="ListNumber"/>
+      </w:pPr>
+      <w:r>
+        <w:t>Purchase_List.pdf — 反光膜、加速计、力传感器等采购清单</w:t>
+      </w:r>
+    </w:p>
+    <w:p>
+      <w:pPr>
+        <w:pStyle w:val="ListNumber"/>
+      </w:pPr>
+      <w:r>
+        <w:t>Laser_Safety_Signoff.pdf — 激光安全告知签字页</w:t>
+      </w:r>
+    </w:p>
+    <w:p>
+      <w:pPr/>
+      <w:r>
+        <w:t>【必存图片】（本步必须拍摄或导出的图，用于论文/答辩/追溯）</w:t>
+      </w:r>
+    </w:p>
+    <w:p>
+      <w:pPr/>
+      <w:r>
+        <w:t>本步无专用图片要求。</w:t>
+      </w:r>
+    </w:p>
+    <w:p>
+      <w:pPr/>
+      <w:r>
         <w:t>现场操作要点（逐项打勾）：</w:t>
       </w:r>
     </w:p>
@@ -585,6 +853,42 @@
     <w:p>
       <w:pPr/>
       <w:r>
+        <w:t>【必存数据】（本步完成后必须存档的文件/文件夹，命名保持一致）</w:t>
+      </w:r>
+    </w:p>
+    <w:p>
+      <w:pPr>
+        <w:pStyle w:val="ListNumber"/>
+      </w:pPr>
+      <w:r>
+        <w:t>A1_Model.step — CAD/几何源文件</w:t>
+      </w:r>
+    </w:p>
+    <w:p>
+      <w:pPr>
+        <w:pStyle w:val="ListNumber"/>
+      </w:pPr>
+      <w:r>
+        <w:t>Simplification_List.docx — 几何简化清单（删/留部件及理由）</w:t>
+      </w:r>
+    </w:p>
+    <w:p>
+      <w:pPr/>
+      <w:r>
+        <w:t>【必存图片】（本步必须拍摄或导出的图，用于论文/答辩/追溯）</w:t>
+      </w:r>
+    </w:p>
+    <w:p>
+      <w:pPr>
+        <w:pStyle w:val="ListNumber"/>
+      </w:pPr>
+      <w:r>
+        <w:t>CAD_Assembly.png — CAD 装配图（标注主要部件与坐标原点）</w:t>
+      </w:r>
+    </w:p>
+    <w:p>
+      <w:pPr/>
+      <w:r>
         <w:t>现场操作要点（逐项打勾）：</w:t>
       </w:r>
     </w:p>
@@ -641,6 +945,34 @@
     <w:p>
       <w:pPr/>
       <w:r>
+        <w:t>【必存数据】（本步完成后必须存档的文件/文件夹，命名保持一致）</w:t>
+      </w:r>
+    </w:p>
+    <w:p>
+      <w:pPr>
+        <w:pStyle w:val="ListNumber"/>
+      </w:pPr>
+      <w:r>
+        <w:t>Mass_Summary.csv — FE 质量/质心与 BOM 或称重对比表</w:t>
+      </w:r>
+    </w:p>
+    <w:p>
+      <w:pPr/>
+      <w:r>
+        <w:t>【必存图片】（本步必须拍摄或导出的图，用于论文/答辩/追溯）</w:t>
+      </w:r>
+    </w:p>
+    <w:p>
+      <w:pPr>
+        <w:pStyle w:val="ListNumber"/>
+      </w:pPr>
+      <w:r>
+        <w:t>Mass_CoG_Compare.png — 质心位置对比示意图</w:t>
+      </w:r>
+    </w:p>
+    <w:p>
+      <w:pPr/>
+      <w:r>
         <w:t>现场操作要点（逐项打勾）：</w:t>
       </w:r>
     </w:p>
@@ -705,6 +1037,34 @@
     <w:p>
       <w:pPr/>
       <w:r>
+        <w:t>【必存数据】（本步完成后必须存档的文件/文件夹，命名保持一致）</w:t>
+      </w:r>
+    </w:p>
+    <w:p>
+      <w:pPr>
+        <w:pStyle w:val="ListNumber"/>
+      </w:pPr>
+      <w:r>
+        <w:t>Joint_Theta0.csv — 结合部参数初值 θ₀、Bounds、物理含义与来源</w:t>
+      </w:r>
+    </w:p>
+    <w:p>
+      <w:pPr/>
+      <w:r>
+        <w:t>【必存图片】（本步必须拍摄或导出的图，用于论文/答辩/追溯）</w:t>
+      </w:r>
+    </w:p>
+    <w:p>
+      <w:pPr>
+        <w:pStyle w:val="ListNumber"/>
+      </w:pPr>
+      <w:r>
+        <w:t>Joint_Locations.png — 结合部位置示意图（标注参数对应位置）</w:t>
+      </w:r>
+    </w:p>
+    <w:p>
+      <w:pPr/>
+      <w:r>
         <w:t>现场操作要点（逐项打勾）：</w:t>
       </w:r>
     </w:p>
@@ -761,6 +1121,34 @@
     <w:p>
       <w:pPr/>
       <w:r>
+        <w:t>【必存数据】（本步完成后必须存档的文件/文件夹，命名保持一致）</w:t>
+      </w:r>
+    </w:p>
+    <w:p>
+      <w:pPr>
+        <w:pStyle w:val="ListNumber"/>
+      </w:pPr>
+      <w:r>
+        <w:t>Boundary_Spec.pdf — 地脚 BC 类型、位置、与 SSS 对应说明</w:t>
+      </w:r>
+    </w:p>
+    <w:p>
+      <w:pPr/>
+      <w:r>
+        <w:t>【必存图片】（本步必须拍摄或导出的图，用于论文/答辩/追溯）</w:t>
+      </w:r>
+    </w:p>
+    <w:p>
+      <w:pPr>
+        <w:pStyle w:val="ListNumber"/>
+      </w:pPr>
+      <w:r>
+        <w:t>BC_Annotation.png — FE 模型边界条件标注图</w:t>
+      </w:r>
+    </w:p>
+    <w:p>
+      <w:pPr/>
+      <w:r>
         <w:t>现场操作要点（逐项打勾）：</w:t>
       </w:r>
     </w:p>
@@ -825,6 +1213,42 @@
     <w:p>
       <w:pPr/>
       <w:r>
+        <w:t>【必存数据】（本步完成后必须存档的文件/文件夹，命名保持一致）</w:t>
+      </w:r>
+    </w:p>
+    <w:p>
+      <w:pPr>
+        <w:pStyle w:val="ListNumber"/>
+      </w:pPr>
+      <w:r>
+        <w:t>Mesh_Convergence.csv — 粗/中/细网格前三阶频率对比表</w:t>
+      </w:r>
+    </w:p>
+    <w:p>
+      <w:pPr/>
+      <w:r>
+        <w:t>【必存图片】（本步必须拍摄或导出的图，用于论文/答辩/追溯）</w:t>
+      </w:r>
+    </w:p>
+    <w:p>
+      <w:pPr>
+        <w:pStyle w:val="ListNumber"/>
+      </w:pPr>
+      <w:r>
+        <w:t>Mesh_Views.png — 网格划分图（整体 + 结合部局部）</w:t>
+      </w:r>
+    </w:p>
+    <w:p>
+      <w:pPr>
+        <w:pStyle w:val="ListNumber"/>
+      </w:pPr>
+      <w:r>
+        <w:t>Mesh_Convergence_Curve.png — 前三阶频率收敛曲线</w:t>
+      </w:r>
+    </w:p>
+    <w:p>
+      <w:pPr/>
+      <w:r>
         <w:t>现场操作要点（逐项打勾）：</w:t>
       </w:r>
     </w:p>
@@ -889,6 +1313,34 @@
     <w:p>
       <w:pPr/>
       <w:r>
+        <w:t>【必存数据】（本步完成后必须存档的文件/文件夹，命名保持一致）</w:t>
+      </w:r>
+    </w:p>
+    <w:p>
+      <w:pPr>
+        <w:pStyle w:val="ListNumber"/>
+      </w:pPr>
+      <w:r>
+        <w:t>Static_Results.rst — 重力静力分析结果文件</w:t>
+      </w:r>
+    </w:p>
+    <w:p>
+      <w:pPr/>
+      <w:r>
+        <w:t>【必存图片】（本步必须拍摄或导出的图，用于论文/答辩/追溯）</w:t>
+      </w:r>
+    </w:p>
+    <w:p>
+      <w:pPr>
+        <w:pStyle w:val="ListNumber"/>
+      </w:pPr>
+      <w:r>
+        <w:t>Static_Deformation.png — 重力变形云图</w:t>
+      </w:r>
+    </w:p>
+    <w:p>
+      <w:pPr/>
+      <w:r>
         <w:t>现场操作要点（逐项打勾）：</w:t>
       </w:r>
     </w:p>
@@ -945,6 +1397,40 @@
     <w:p>
       <w:pPr/>
       <w:r>
+        <w:t>【必存数据】（本步完成后必须存档的文件/文件夹，命名保持一致）</w:t>
+      </w:r>
+    </w:p>
+    <w:p>
+      <w:pPr>
+        <w:pStyle w:val="ListNumber"/>
+      </w:pPr>
+      <w:r>
+        <w:t>Modal_Results.rst — 预应力模态分析结果</w:t>
+      </w:r>
+    </w:p>
+    <w:p>
+      <w:pPr>
+        <w:pStyle w:val="ListNumber"/>
+      </w:pPr>
+      <w:r>
+        <w:t>Modal_Settings.txt — 模态分析设置（阶次、频率范围、预应力链接）</w:t>
+      </w:r>
+    </w:p>
+    <w:p>
+      <w:pPr/>
+      <w:r>
+        <w:t>【必存图片】（本步必须拍摄或导出的图，用于论文/答辩/追溯）</w:t>
+      </w:r>
+    </w:p>
+    <w:p>
+      <w:pPr/>
+      <w:r>
+        <w:t>本步无专用图片要求。</w:t>
+      </w:r>
+    </w:p>
+    <w:p>
+      <w:pPr/>
+      <w:r>
         <w:t>现场操作要点（逐项打勾）：</w:t>
       </w:r>
     </w:p>
@@ -1001,6 +1487,34 @@
     <w:p>
       <w:pPr/>
       <w:r>
+        <w:t>【必存数据】（本步完成后必须存档的文件/文件夹，命名保持一致）</w:t>
+      </w:r>
+    </w:p>
+    <w:p>
+      <w:pPr>
+        <w:pStyle w:val="ListNumber"/>
+      </w:pPr>
+      <w:r>
+        <w:t>Elastic_Modes_6.csv — 6 阶弹性模态频率及剔除记录</w:t>
+      </w:r>
+    </w:p>
+    <w:p>
+      <w:pPr/>
+      <w:r>
+        <w:t>【必存图片】（本步必须拍摄或导出的图，用于论文/答辩/追溯）</w:t>
+      </w:r>
+    </w:p>
+    <w:p>
+      <w:pPr>
+        <w:pStyle w:val="ListNumber"/>
+      </w:pPr>
+      <w:r>
+        <w:t>FE_Mode1-6.png — FE 前 6 阶弹性模态振型图（可 6 张或拼图）</w:t>
+      </w:r>
+    </w:p>
+    <w:p>
+      <w:pPr/>
+      <w:r>
         <w:t>现场操作要点（逐项打勾）：</w:t>
       </w:r>
     </w:p>
@@ -1065,6 +1579,34 @@
     <w:p>
       <w:pPr/>
       <w:r>
+        <w:t>【必存数据】（本步完成后必须存档的文件/文件夹，命名保持一致）</w:t>
+      </w:r>
+    </w:p>
+    <w:p>
+      <w:pPr>
+        <w:pStyle w:val="ListNumber"/>
+      </w:pPr>
+      <w:r>
+        <w:t>P1-P12_Mapping.csv — 测点/激励点/TP 映射节点与距离 d</w:t>
+      </w:r>
+    </w:p>
+    <w:p>
+      <w:pPr/>
+      <w:r>
+        <w:t>【必存图片】（本步必须拍摄或导出的图，用于论文/答辩/追溯）</w:t>
+      </w:r>
+    </w:p>
+    <w:p>
+      <w:pPr>
+        <w:pStyle w:val="ListNumber"/>
+      </w:pPr>
+      <w:r>
+        <w:t>Point_Layout.png — 测点布置图（FE 与实验对照）</w:t>
+      </w:r>
+    </w:p>
+    <w:p>
+      <w:pPr/>
+      <w:r>
         <w:t>现场操作要点（逐项打勾）：</w:t>
       </w:r>
     </w:p>
@@ -1121,6 +1663,34 @@
     <w:p>
       <w:pPr/>
       <w:r>
+        <w:t>【必存数据】（本步完成后必须存档的文件/文件夹，命名保持一致）</w:t>
+      </w:r>
+    </w:p>
+    <w:p>
+      <w:pPr>
+        <w:pStyle w:val="ListNumber"/>
+      </w:pPr>
+      <w:r>
+        <w:t>Sensitivity.csv — 参数灵敏度分析结果</w:t>
+      </w:r>
+    </w:p>
+    <w:p>
+      <w:pPr/>
+      <w:r>
+        <w:t>【必存图片】（本步必须拍摄或导出的图，用于论文/答辩/追溯）</w:t>
+      </w:r>
+    </w:p>
+    <w:p>
+      <w:pPr>
+        <w:pStyle w:val="ListNumber"/>
+      </w:pPr>
+      <w:r>
+        <w:t>Sensitivity_Tornado.png — 灵敏度龙卷风图</w:t>
+      </w:r>
+    </w:p>
+    <w:p>
+      <w:pPr/>
+      <w:r>
         <w:t>现场操作要点（逐项打勾）：</w:t>
       </w:r>
     </w:p>
@@ -1185,6 +1755,34 @@
     <w:p>
       <w:pPr/>
       <w:r>
+        <w:t>【必存数据】（本步完成后必须存档的文件/文件夹，命名保持一致）</w:t>
+      </w:r>
+    </w:p>
+    <w:p>
+      <w:pPr>
+        <w:pStyle w:val="ListNumber"/>
+      </w:pPr>
+      <w:r>
+        <w:t>FE_Y_Extreme.wbpz — Y 极限构型 FE 工程文件</w:t>
+      </w:r>
+    </w:p>
+    <w:p>
+      <w:pPr/>
+      <w:r>
+        <w:t>【必存图片】（本步必须拍摄或导出的图，用于论文/答辩/追溯）</w:t>
+      </w:r>
+    </w:p>
+    <w:p>
+      <w:pPr>
+        <w:pStyle w:val="ListNumber"/>
+      </w:pPr>
+      <w:r>
+        <w:t>Y_Extreme_Config.png — Y 极限轴位与拖链/电缆姿态截图或示意图</w:t>
+      </w:r>
+    </w:p>
+    <w:p>
+      <w:pPr/>
+      <w:r>
         <w:t>现场操作要点（逐项打勾）：</w:t>
       </w:r>
     </w:p>
@@ -1249,6 +1847,40 @@
     <w:p>
       <w:pPr/>
       <w:r>
+        <w:t>【必存数据】（本步完成后必须存档的文件/文件夹，命名保持一致）</w:t>
+      </w:r>
+    </w:p>
+    <w:p>
+      <w:pPr>
+        <w:pStyle w:val="ListNumber"/>
+      </w:pPr>
+      <w:r>
+        <w:t>Baseline_FE_v0.wbpz — 冻结 Baseline 有限元工程</w:t>
+      </w:r>
+    </w:p>
+    <w:p>
+      <w:pPr>
+        <w:pStyle w:val="ListNumber"/>
+      </w:pPr>
+      <w:r>
+        <w:t>Gate_G1.pdf — G1 门禁签字记录</w:t>
+      </w:r>
+    </w:p>
+    <w:p>
+      <w:pPr/>
+      <w:r>
+        <w:t>【必存图片】（本步必须拍摄或导出的图，用于论文/答辩/追溯）</w:t>
+      </w:r>
+    </w:p>
+    <w:p>
+      <w:pPr/>
+      <w:r>
+        <w:t>本步无专用图片要求。</w:t>
+      </w:r>
+    </w:p>
+    <w:p>
+      <w:pPr/>
+      <w:r>
         <w:t>现场操作要点（逐项打勾）：</w:t>
       </w:r>
     </w:p>
@@ -1321,6 +1953,42 @@
     <w:p>
       <w:pPr/>
       <w:r>
+        <w:t>【必存数据】（本步完成后必须存档的文件/文件夹，命名保持一致）</w:t>
+      </w:r>
+    </w:p>
+    <w:p>
+      <w:pPr>
+        <w:pStyle w:val="ListNumber"/>
+      </w:pPr>
+      <w:r>
+        <w:t>SSS_Checklist_Signed.pdf — 当次实验 SSS 核对签字版</w:t>
+      </w:r>
+    </w:p>
+    <w:p>
+      <w:pPr/>
+      <w:r>
+        <w:t>【必存图片】（本步必须拍摄或导出的图，用于论文/答辩/追溯）</w:t>
+      </w:r>
+    </w:p>
+    <w:p>
+      <w:pPr>
+        <w:pStyle w:val="ListNumber"/>
+      </w:pPr>
+      <w:r>
+        <w:t>Machine_4Views.jpg — 机床四向现场照片</w:t>
+      </w:r>
+    </w:p>
+    <w:p>
+      <w:pPr>
+        <w:pStyle w:val="ListNumber"/>
+      </w:pPr>
+      <w:r>
+        <w:t>AxisPosition_Screenshot.png — 数控系统轴位截图（含 X/Y/Z）</w:t>
+      </w:r>
+    </w:p>
+    <w:p>
+      <w:pPr/>
+      <w:r>
         <w:t>现场操作要点（逐项打勾）：</w:t>
       </w:r>
     </w:p>
@@ -1377,6 +2045,32 @@
     <w:p>
       <w:pPr/>
       <w:r>
+        <w:t>【必存数据】（本步完成后必须存档的文件/文件夹，命名保持一致）</w:t>
+      </w:r>
+    </w:p>
+    <w:p>
+      <w:pPr>
+        <w:pStyle w:val="ListNumber"/>
+      </w:pPr>
+      <w:r>
+        <w:t>Environment_Log.csv — 温度、湿度、干扰源、静置时间记录</w:t>
+      </w:r>
+    </w:p>
+    <w:p>
+      <w:pPr/>
+      <w:r>
+        <w:t>【必存图片】（本步必须拍摄或导出的图，用于论文/答辩/追溯）</w:t>
+      </w:r>
+    </w:p>
+    <w:p>
+      <w:pPr/>
+      <w:r>
+        <w:t>本步无专用图片要求。</w:t>
+      </w:r>
+    </w:p>
+    <w:p>
+      <w:pPr/>
+      <w:r>
         <w:t>现场操作要点（逐项打勾）：</w:t>
       </w:r>
     </w:p>
@@ -1433,6 +2127,34 @@
     <w:p>
       <w:pPr/>
       <w:r>
+        <w:t>【必存数据】（本步完成后必须存档的文件/文件夹，命名保持一致）</w:t>
+      </w:r>
+    </w:p>
+    <w:p>
+      <w:pPr>
+        <w:pStyle w:val="ListNumber"/>
+      </w:pPr>
+      <w:r>
+        <w:t>Background_Noise.csv — 30 s 背景噪底数据</w:t>
+      </w:r>
+    </w:p>
+    <w:p>
+      <w:pPr/>
+      <w:r>
+        <w:t>【必存图片】（本步必须拍摄或导出的图，用于论文/答辩/追溯）</w:t>
+      </w:r>
+    </w:p>
+    <w:p>
+      <w:pPr>
+        <w:pStyle w:val="ListNumber"/>
+      </w:pPr>
+      <w:r>
+        <w:t>Background_Spectrum.png — 背景噪底频谱图</w:t>
+      </w:r>
+    </w:p>
+    <w:p>
+      <w:pPr/>
+      <w:r>
         <w:t>现场操作要点（逐项打勾）：</w:t>
       </w:r>
     </w:p>
@@ -1497,6 +2219,42 @@
     <w:p>
       <w:pPr/>
       <w:r>
+        <w:t>【必存数据】（本步完成后必须存档的文件/文件夹，命名保持一致）</w:t>
+      </w:r>
+    </w:p>
+    <w:p>
+      <w:pPr>
+        <w:pStyle w:val="ListNumber"/>
+      </w:pPr>
+      <w:r>
+        <w:t>System_Config.txt — SLDV 软硬件版本、采样率、平均次数等 Setup 参数</w:t>
+      </w:r>
+    </w:p>
+    <w:p>
+      <w:pPr>
+        <w:pStyle w:val="ListNumber"/>
+      </w:pPr>
+      <w:r>
+        <w:t>Modal_ID_Settings.txt — 模态识别软件设置（与 C1 一致）</w:t>
+      </w:r>
+    </w:p>
+    <w:p>
+      <w:pPr/>
+      <w:r>
+        <w:t>【必存图片】（本步必须拍摄或导出的图，用于论文/答辩/追溯）</w:t>
+      </w:r>
+    </w:p>
+    <w:p>
+      <w:pPr>
+        <w:pStyle w:val="ListNumber"/>
+      </w:pPr>
+      <w:r>
+        <w:t>SLDV_Setup_Photo.jpg — SLDV Setup 现场照片</w:t>
+      </w:r>
+    </w:p>
+    <w:p>
+      <w:pPr/>
+      <w:r>
         <w:t>现场操作要点（逐项打勾）：</w:t>
       </w:r>
     </w:p>
@@ -1553,6 +2311,34 @@
     <w:p>
       <w:pPr/>
       <w:r>
+        <w:t>【必存数据】（本步完成后必须存档的文件/文件夹，命名保持一致）</w:t>
+      </w:r>
+    </w:p>
+    <w:p>
+      <w:pPr>
+        <w:pStyle w:val="ListNumber"/>
+      </w:pPr>
+      <w:r>
+        <w:t>ScanZone_A.csv — 区 A polygon 顶点坐标与 d_min</w:t>
+      </w:r>
+    </w:p>
+    <w:p>
+      <w:pPr/>
+      <w:r>
+        <w:t>【必存图片】（本步必须拍摄或导出的图，用于论文/答辩/追溯）</w:t>
+      </w:r>
+    </w:p>
+    <w:p>
+      <w:pPr>
+        <w:pStyle w:val="ListNumber"/>
+      </w:pPr>
+      <w:r>
+        <w:t>ScanZone_A_Map.png — 区 A 示意图（边界 + 盲验点位置）</w:t>
+      </w:r>
+    </w:p>
+    <w:p>
+      <w:pPr/>
+      <w:r>
         <w:t>现场操作要点（逐项打勾）：</w:t>
       </w:r>
     </w:p>
@@ -1609,6 +2395,40 @@
     <w:p>
       <w:pPr/>
       <w:r>
+        <w:t>【必存数据】（本步完成后必须存档的文件/文件夹，命名保持一致）</w:t>
+      </w:r>
+    </w:p>
+    <w:p>
+      <w:pPr>
+        <w:pStyle w:val="ListNumber"/>
+      </w:pPr>
+      <w:r>
+        <w:t>E1_C0_SLDV_Raw/ — B1 全部原始数据（3 激励 ×5 trial，只读）</w:t>
+      </w:r>
+    </w:p>
+    <w:p>
+      <w:pPr>
+        <w:pStyle w:val="ListNumber"/>
+      </w:pPr>
+      <w:r>
+        <w:t>Trial_Log_B1.csv — 每次 trial 力幅、激励点、操作者、异常备注</w:t>
+      </w:r>
+    </w:p>
+    <w:p>
+      <w:pPr/>
+      <w:r>
+        <w:t>【必存图片】（本步必须拍摄或导出的图，用于论文/答辩/追溯）</w:t>
+      </w:r>
+    </w:p>
+    <w:p>
+      <w:pPr/>
+      <w:r>
+        <w:t>本步无专用图片要求。</w:t>
+      </w:r>
+    </w:p>
+    <w:p>
+      <w:pPr/>
+      <w:r>
         <w:t>现场操作要点（逐项打勾）：</w:t>
       </w:r>
     </w:p>
@@ -1665,6 +2485,34 @@
     <w:p>
       <w:pPr/>
       <w:r>
+        <w:t>【必存数据】（本步完成后必须存档的文件/文件夹，命名保持一致）</w:t>
+      </w:r>
+    </w:p>
+    <w:p>
+      <w:pPr>
+        <w:pStyle w:val="ListNumber"/>
+      </w:pPr>
+      <w:r>
+        <w:t>Linearity_Check.pdf — 力锤轻/重敲线性检验记录与结论</w:t>
+      </w:r>
+    </w:p>
+    <w:p>
+      <w:pPr/>
+      <w:r>
+        <w:t>【必存图片】（本步必须拍摄或导出的图，用于论文/答辩/追溯）</w:t>
+      </w:r>
+    </w:p>
+    <w:p>
+      <w:pPr>
+        <w:pStyle w:val="ListNumber"/>
+      </w:pPr>
+      <w:r>
+        <w:t>Linearity_FRF_Compare.png — 轻/重敲 FRF 对比（建议存）</w:t>
+      </w:r>
+    </w:p>
+    <w:p>
+      <w:pPr/>
+      <w:r>
         <w:t>现场操作要点（逐项打勾）：</w:t>
       </w:r>
     </w:p>
@@ -1721,6 +2569,40 @@
     <w:p>
       <w:pPr/>
       <w:r>
+        <w:t>【必存数据】（本步完成后必须存档的文件/文件夹，命名保持一致）</w:t>
+      </w:r>
+    </w:p>
+    <w:p>
+      <w:pPr>
+        <w:pStyle w:val="ListNumber"/>
+      </w:pPr>
+      <w:r>
+        <w:t>E3_C0_EMA/ — EMA P1–P9 原始数据</w:t>
+      </w:r>
+    </w:p>
+    <w:p>
+      <w:pPr>
+        <w:pStyle w:val="ListNumber"/>
+      </w:pPr>
+      <w:r>
+        <w:t>CrossCheck_P1-P3.csv — P1–P3 同点 SLDV/EMA 交叉验证记录</w:t>
+      </w:r>
+    </w:p>
+    <w:p>
+      <w:pPr/>
+      <w:r>
+        <w:t>【必存图片】（本步必须拍摄或导出的图，用于论文/答辩/追溯）</w:t>
+      </w:r>
+    </w:p>
+    <w:p>
+      <w:pPr/>
+      <w:r>
+        <w:t>本步无专用图片要求。</w:t>
+      </w:r>
+    </w:p>
+    <w:p>
+      <w:pPr/>
+      <w:r>
         <w:t>现场操作要点（逐项打勾）：</w:t>
       </w:r>
     </w:p>
@@ -1771,6 +2653,40 @@
     <w:p>
       <w:pPr/>
       <w:r>
+        <w:t>【必存数据】（本步完成后必须存档的文件/文件夹，命名保持一致）</w:t>
+      </w:r>
+    </w:p>
+    <w:p>
+      <w:pPr>
+        <w:pStyle w:val="ListNumber"/>
+      </w:pPr>
+      <w:r>
+        <w:t>Backup_Log_B1.txt — 双备份路径、日期、文件大小/校验信息</w:t>
+      </w:r>
+    </w:p>
+    <w:p>
+      <w:pPr>
+        <w:pStyle w:val="ListNumber"/>
+      </w:pPr>
+      <w:r>
+        <w:t>Experiment_Matrix 更新 — 登记 B1 raw 与备份位置</w:t>
+      </w:r>
+    </w:p>
+    <w:p>
+      <w:pPr/>
+      <w:r>
+        <w:t>【必存图片】（本步必须拍摄或导出的图，用于论文/答辩/追溯）</w:t>
+      </w:r>
+    </w:p>
+    <w:p>
+      <w:pPr/>
+      <w:r>
+        <w:t>本步无专用图片要求。</w:t>
+      </w:r>
+    </w:p>
+    <w:p>
+      <w:pPr/>
+      <w:r>
         <w:t>现场操作要点（逐项打勾）：</w:t>
       </w:r>
     </w:p>
@@ -1835,6 +2751,42 @@
     <w:p>
       <w:pPr/>
       <w:r>
+        <w:t>【必存数据】（本步完成后必须存档的文件/文件夹，命名保持一致）</w:t>
+      </w:r>
+    </w:p>
+    <w:p>
+      <w:pPr>
+        <w:pStyle w:val="ListNumber"/>
+      </w:pPr>
+      <w:r>
+        <w:t>E4_C1_SLDV_Raw/ — Y 极限构型 SLDV 原始数据（禁止用于 refit θ*）</w:t>
+      </w:r>
+    </w:p>
+    <w:p>
+      <w:pPr/>
+      <w:r>
+        <w:t>【必存图片】（本步必须拍摄或导出的图，用于论文/答辩/追溯）</w:t>
+      </w:r>
+    </w:p>
+    <w:p>
+      <w:pPr>
+        <w:pStyle w:val="ListNumber"/>
+      </w:pPr>
+      <w:r>
+        <w:t>Y_Extreme_Axis.png — Y 极限轴位截图</w:t>
+      </w:r>
+    </w:p>
+    <w:p>
+      <w:pPr>
+        <w:pStyle w:val="ListNumber"/>
+      </w:pPr>
+      <w:r>
+        <w:t>Y_Extreme_4Views.jpg — 若相对 B1 状态变化，补四向照片</w:t>
+      </w:r>
+    </w:p>
+    <w:p>
+      <w:pPr/>
+      <w:r>
         <w:t>现场操作要点（逐项打勾）：</w:t>
       </w:r>
     </w:p>
@@ -1893,6 +2845,50 @@
     <w:p>
       <w:pPr/>
       <w:r>
+        <w:t>【必存数据】（本步完成后必须存档的文件/文件夹，命名保持一致）</w:t>
+      </w:r>
+    </w:p>
+    <w:p>
+      <w:pPr>
+        <w:pStyle w:val="ListNumber"/>
+      </w:pPr>
+      <w:r>
+        <w:t>Blind_P10/ — P10 盲验 raw（封存）</w:t>
+      </w:r>
+    </w:p>
+    <w:p>
+      <w:pPr>
+        <w:pStyle w:val="ListNumber"/>
+      </w:pPr>
+      <w:r>
+        <w:t>Blind_P11/ — P11 盲验 raw（封存）</w:t>
+      </w:r>
+    </w:p>
+    <w:p>
+      <w:pPr>
+        <w:pStyle w:val="ListNumber"/>
+      </w:pPr>
+      <w:r>
+        <w:t>Blind_P12/ — P12 盲验 raw（封存）</w:t>
+      </w:r>
+    </w:p>
+    <w:p>
+      <w:pPr/>
+      <w:r>
+        <w:t>【必存图片】（本步必须拍摄或导出的图，用于论文/答辩/追溯）</w:t>
+      </w:r>
+    </w:p>
+    <w:p>
+      <w:pPr>
+        <w:pStyle w:val="ListNumber"/>
+      </w:pPr>
+      <w:r>
+        <w:t>BlindPoints_Layout.jpg — P10–P12 位置实物图（与 Pre-registration 对照）</w:t>
+      </w:r>
+    </w:p>
+    <w:p>
+      <w:pPr/>
+      <w:r>
         <w:t>现场操作要点（逐项打勾）：</w:t>
       </w:r>
     </w:p>
@@ -1943,6 +2939,48 @@
     <w:p>
       <w:pPr/>
       <w:r>
+        <w:t>【必存数据】（本步完成后必须存档的文件/文件夹，命名保持一致）</w:t>
+      </w:r>
+    </w:p>
+    <w:p>
+      <w:pPr>
+        <w:pStyle w:val="ListNumber"/>
+      </w:pPr>
+      <w:r>
+        <w:t>Blind_P10/Trial1-5/ — P10 五次重复 raw</w:t>
+      </w:r>
+    </w:p>
+    <w:p>
+      <w:pPr>
+        <w:pStyle w:val="ListNumber"/>
+      </w:pPr>
+      <w:r>
+        <w:t>Blind_P11/Trial1-5/ — P11 五次重复 raw</w:t>
+      </w:r>
+    </w:p>
+    <w:p>
+      <w:pPr>
+        <w:pStyle w:val="ListNumber"/>
+      </w:pPr>
+      <w:r>
+        <w:t>Blind_P12/Trial1-5/ — P12 五次重复 raw</w:t>
+      </w:r>
+    </w:p>
+    <w:p>
+      <w:pPr/>
+      <w:r>
+        <w:t>【必存图片】（本步必须拍摄或导出的图，用于论文/答辩/追溯）</w:t>
+      </w:r>
+    </w:p>
+    <w:p>
+      <w:pPr/>
+      <w:r>
+        <w:t>本步无专用图片要求。</w:t>
+      </w:r>
+    </w:p>
+    <w:p>
+      <w:pPr/>
+      <w:r>
         <w:t>现场操作要点（逐项打勾）：</w:t>
       </w:r>
     </w:p>
@@ -1993,6 +3031,40 @@
     <w:p>
       <w:pPr/>
       <w:r>
+        <w:t>【必存数据】（本步完成后必须存档的文件/文件夹，命名保持一致）</w:t>
+      </w:r>
+    </w:p>
+    <w:p>
+      <w:pPr>
+        <w:pStyle w:val="ListNumber"/>
+      </w:pPr>
+      <w:r>
+        <w:t>Seal_Record.pdf — 盲验数据封存记录（日期、见证人）</w:t>
+      </w:r>
+    </w:p>
+    <w:p>
+      <w:pPr>
+        <w:pStyle w:val="ListNumber"/>
+      </w:pPr>
+      <w:r>
+        <w:t>Unseal_Record.pdf — 开封记录（须晚于 θ* 冻结，E1 填写）</w:t>
+      </w:r>
+    </w:p>
+    <w:p>
+      <w:pPr/>
+      <w:r>
+        <w:t>【必存图片】（本步必须拍摄或导出的图，用于论文/答辩/追溯）</w:t>
+      </w:r>
+    </w:p>
+    <w:p>
+      <w:pPr/>
+      <w:r>
+        <w:t>本步无专用图片要求。</w:t>
+      </w:r>
+    </w:p>
+    <w:p>
+      <w:pPr/>
+      <w:r>
         <w:t>现场操作要点（逐项打勾）：</w:t>
       </w:r>
     </w:p>
@@ -2057,6 +3129,34 @@
     <w:p>
       <w:pPr/>
       <w:r>
+        <w:t>【必存数据】（本步完成后必须存档的文件/文件夹，命名保持一致）</w:t>
+      </w:r>
+    </w:p>
+    <w:p>
+      <w:pPr>
+        <w:pStyle w:val="ListNumber"/>
+      </w:pPr>
+      <w:r>
+        <w:t>B4_Retest_Log.pdf — 重测原因、新实验编号、与失败 batch 关系说明</w:t>
+      </w:r>
+    </w:p>
+    <w:p>
+      <w:pPr/>
+      <w:r>
+        <w:t>【必存图片】（本步必须拍摄或导出的图，用于论文/答辩/追溯）</w:t>
+      </w:r>
+    </w:p>
+    <w:p>
+      <w:pPr>
+        <w:pStyle w:val="ListNumber"/>
+      </w:pPr>
+      <w:r>
+        <w:t>若重测因机床状态变化：补 Machine_4Views.jpg + AxisPosition_Screenshot.png</w:t>
+      </w:r>
+    </w:p>
+    <w:p>
+      <w:pPr/>
+      <w:r>
         <w:t>现场操作要点（逐项打勾）：</w:t>
       </w:r>
     </w:p>
@@ -2121,6 +3221,42 @@
     <w:p>
       <w:pPr/>
       <w:r>
+        <w:t>【必存数据】（本步完成后必须存档的文件/文件夹，命名保持一致）</w:t>
+      </w:r>
+    </w:p>
+    <w:p>
+      <w:pPr>
+        <w:pStyle w:val="ListNumber"/>
+      </w:pPr>
+      <w:r>
+        <w:t>Modal_Parameters.csv — 实验识别模态参数（频率、阻尼等）</w:t>
+      </w:r>
+    </w:p>
+    <w:p>
+      <w:pPr>
+        <w:pStyle w:val="ListNumber"/>
+      </w:pPr>
+      <w:r>
+        <w:t>Pole_Rejection_Log.csv — 剔除极点清单与原因</w:t>
+      </w:r>
+    </w:p>
+    <w:p>
+      <w:pPr/>
+      <w:r>
+        <w:t>【必存图片】（本步必须拍摄或导出的图，用于论文/答辩/追溯）</w:t>
+      </w:r>
+    </w:p>
+    <w:p>
+      <w:pPr>
+        <w:pStyle w:val="ListNumber"/>
+      </w:pPr>
+      <w:r>
+        <w:t>Stabilization_Diagram.png — 稳态图</w:t>
+      </w:r>
+    </w:p>
+    <w:p>
+      <w:pPr/>
+      <w:r>
         <w:t>现场操作要点（逐项打勾）：</w:t>
       </w:r>
     </w:p>
@@ -2177,6 +3313,34 @@
     <w:p>
       <w:pPr/>
       <w:r>
+        <w:t>【必存数据】（本步完成后必须存档的文件/文件夹，命名保持一致）</w:t>
+      </w:r>
+    </w:p>
+    <w:p>
+      <w:pPr>
+        <w:pStyle w:val="ListNumber"/>
+      </w:pPr>
+      <w:r>
+        <w:t>Mode_Pairing_Table.xlsx — Exp↔FE 配对表（含歧义说明）</w:t>
+      </w:r>
+    </w:p>
+    <w:p>
+      <w:pPr/>
+      <w:r>
+        <w:t>【必存图片】（本步必须拍摄或导出的图，用于论文/答辩/追溯）</w:t>
+      </w:r>
+    </w:p>
+    <w:p>
+      <w:pPr>
+        <w:pStyle w:val="ListNumber"/>
+      </w:pPr>
+      <w:r>
+        <w:t>Exp_Mode1-6.png — 实验前 6 阶模态振型图</w:t>
+      </w:r>
+    </w:p>
+    <w:p>
+      <w:pPr/>
+      <w:r>
         <w:t>现场操作要点（逐项打勾）：</w:t>
       </w:r>
     </w:p>
@@ -2233,6 +3397,34 @@
     <w:p>
       <w:pPr/>
       <w:r>
+        <w:t>【必存数据】（本步完成后必须存档的文件/文件夹，命名保持一致）</w:t>
+      </w:r>
+    </w:p>
+    <w:p>
+      <w:pPr>
+        <w:pStyle w:val="ListNumber"/>
+      </w:pPr>
+      <w:r>
+        <w:t>Repeatability.csv — 5 次 trial 频率/MAC 的 mean±std</w:t>
+      </w:r>
+    </w:p>
+    <w:p>
+      <w:pPr/>
+      <w:r>
+        <w:t>【必存图片】（本步必须拍摄或导出的图，用于论文/答辩/追溯）</w:t>
+      </w:r>
+    </w:p>
+    <w:p>
+      <w:pPr>
+        <w:pStyle w:val="ListNumber"/>
+      </w:pPr>
+      <w:r>
+        <w:t>Repeatability_Bars.png — 重复性误差棒图</w:t>
+      </w:r>
+    </w:p>
+    <w:p>
+      <w:pPr/>
+      <w:r>
         <w:t>现场操作要点（逐项打勾）：</w:t>
       </w:r>
     </w:p>
@@ -2283,6 +3475,32 @@
     <w:p>
       <w:pPr/>
       <w:r>
+        <w:t>【必存数据】（本步完成后必须存档的文件/文件夹，命名保持一致）</w:t>
+      </w:r>
+    </w:p>
+    <w:p>
+      <w:pPr>
+        <w:pStyle w:val="ListNumber"/>
+      </w:pPr>
+      <w:r>
+        <w:t>Gate_G2.pdf — G2 配对表冻结签字记录</w:t>
+      </w:r>
+    </w:p>
+    <w:p>
+      <w:pPr/>
+      <w:r>
+        <w:t>【必存图片】（本步必须拍摄或导出的图，用于论文/答辩/追溯）</w:t>
+      </w:r>
+    </w:p>
+    <w:p>
+      <w:pPr/>
+      <w:r>
+        <w:t>本步无专用图片要求。</w:t>
+      </w:r>
+    </w:p>
+    <w:p>
+      <w:pPr/>
+      <w:r>
         <w:t>现场操作要点（逐项打勾）：</w:t>
       </w:r>
     </w:p>
@@ -2347,6 +3565,34 @@
     <w:p>
       <w:pPr/>
       <w:r>
+        <w:t>【必存数据】（本步完成后必须存档的文件/文件夹，命名保持一致）</w:t>
+      </w:r>
+    </w:p>
+    <w:p>
+      <w:pPr>
+        <w:pStyle w:val="ListNumber"/>
+      </w:pPr>
+      <w:r>
+        <w:t>Freq_MAC_Before.csv — 修正前 Baseline 与实验频率/MAC 对比</w:t>
+      </w:r>
+    </w:p>
+    <w:p>
+      <w:pPr/>
+      <w:r>
+        <w:t>【必存图片】（本步必须拍摄或导出的图，用于论文/答辩/追溯）</w:t>
+      </w:r>
+    </w:p>
+    <w:p>
+      <w:pPr>
+        <w:pStyle w:val="ListNumber"/>
+      </w:pPr>
+      <w:r>
+        <w:t>Before_Compare.png — Before 频率 + MAC 对比图</w:t>
+      </w:r>
+    </w:p>
+    <w:p>
+      <w:pPr/>
+      <w:r>
         <w:t>现场操作要点（逐项打勾）：</w:t>
       </w:r>
     </w:p>
@@ -2397,6 +3643,32 @@
     <w:p>
       <w:pPr/>
       <w:r>
+        <w:t>【必存数据】（本步完成后必须存档的文件/文件夹，命名保持一致）</w:t>
+      </w:r>
+    </w:p>
+    <w:p>
+      <w:pPr>
+        <w:pStyle w:val="ListNumber"/>
+      </w:pPr>
+      <w:r>
+        <w:t>Objective_Function.txt — J(θ) 定义、权重、仅用 P1–P9 的声明</w:t>
+      </w:r>
+    </w:p>
+    <w:p>
+      <w:pPr/>
+      <w:r>
+        <w:t>【必存图片】（本步必须拍摄或导出的图，用于论文/答辩/追溯）</w:t>
+      </w:r>
+    </w:p>
+    <w:p>
+      <w:pPr/>
+      <w:r>
+        <w:t>本步无专用图片要求。</w:t>
+      </w:r>
+    </w:p>
+    <w:p>
+      <w:pPr/>
+      <w:r>
         <w:t>现场操作要点（逐项打勾）：</w:t>
       </w:r>
     </w:p>
@@ -2447,6 +3719,42 @@
     <w:p>
       <w:pPr/>
       <w:r>
+        <w:t>【必存数据】（本步完成后必须存档的文件/文件夹，命名保持一致）</w:t>
+      </w:r>
+    </w:p>
+    <w:p>
+      <w:pPr>
+        <w:pStyle w:val="ListNumber"/>
+      </w:pPr>
+      <w:r>
+        <w:t>Iteration_Log.csv — 每轮迭代参数、目标函数值、是否满足 Bounds</w:t>
+      </w:r>
+    </w:p>
+    <w:p>
+      <w:pPr>
+        <w:pStyle w:val="ListNumber"/>
+      </w:pPr>
+      <w:r>
+        <w:t>Lcurve_Selection.pdf — L-curve 选参记录</w:t>
+      </w:r>
+    </w:p>
+    <w:p>
+      <w:pPr/>
+      <w:r>
+        <w:t>【必存图片】（本步必须拍摄或导出的图，用于论文/答辩/追溯）</w:t>
+      </w:r>
+    </w:p>
+    <w:p>
+      <w:pPr>
+        <w:pStyle w:val="ListNumber"/>
+      </w:pPr>
+      <w:r>
+        <w:t>J_Convergence.png — J(θ) 收敛曲线</w:t>
+      </w:r>
+    </w:p>
+    <w:p>
+      <w:pPr/>
+      <w:r>
         <w:t>现场操作要点（逐项打勾）：</w:t>
       </w:r>
     </w:p>
@@ -2497,6 +3805,42 @@
     <w:p>
       <w:pPr/>
       <w:r>
+        <w:t>【必存数据】（本步完成后必须存档的文件/文件夹，命名保持一致）</w:t>
+      </w:r>
+    </w:p>
+    <w:p>
+      <w:pPr>
+        <w:pStyle w:val="ListNumber"/>
+      </w:pPr>
+      <w:r>
+        <w:t>10start/ — 10 组初值优化结果（SCI 储备）</w:t>
+      </w:r>
+    </w:p>
+    <w:p>
+      <w:pPr>
+        <w:pStyle w:val="ListNumber"/>
+      </w:pPr>
+      <w:r>
+        <w:t>MultiStart_Summary.csv — 多初值 θ* 对比汇总</w:t>
+      </w:r>
+    </w:p>
+    <w:p>
+      <w:pPr/>
+      <w:r>
+        <w:t>【必存图片】（本步必须拍摄或导出的图，用于论文/答辩/追溯）</w:t>
+      </w:r>
+    </w:p>
+    <w:p>
+      <w:pPr>
+        <w:pStyle w:val="ListNumber"/>
+      </w:pPr>
+      <w:r>
+        <w:t>MultiStart_Boxplot.png — 多初值结果 boxplot（SCI 储备，建议存）</w:t>
+      </w:r>
+    </w:p>
+    <w:p>
+      <w:pPr/>
+      <w:r>
         <w:t>现场操作要点（逐项打勾）：</w:t>
       </w:r>
     </w:p>
@@ -2547,6 +3891,50 @@
     <w:p>
       <w:pPr/>
       <w:r>
+        <w:t>【必存数据】（本步完成后必须存档的文件/文件夹，命名保持一致）</w:t>
+      </w:r>
+    </w:p>
+    <w:p>
+      <w:pPr>
+        <w:pStyle w:val="ListNumber"/>
+      </w:pPr>
+      <w:r>
+        <w:t>Updated_FE_ThetaStar.wbpz — 修正后冻结 FE 工程</w:t>
+      </w:r>
+    </w:p>
+    <w:p>
+      <w:pPr>
+        <w:pStyle w:val="ListNumber"/>
+      </w:pPr>
+      <w:r>
+        <w:t>Gate_G3.pdf — G3 门禁签字记录</w:t>
+      </w:r>
+    </w:p>
+    <w:p>
+      <w:pPr>
+        <w:pStyle w:val="ListNumber"/>
+      </w:pPr>
+      <w:r>
+        <w:t>ThetaStar_Frozen.csv — θ* 参数终值与 Bounds</w:t>
+      </w:r>
+    </w:p>
+    <w:p>
+      <w:pPr/>
+      <w:r>
+        <w:t>【必存图片】（本步必须拍摄或导出的图，用于论文/答辩/追溯）</w:t>
+      </w:r>
+    </w:p>
+    <w:p>
+      <w:pPr>
+        <w:pStyle w:val="ListNumber"/>
+      </w:pPr>
+      <w:r>
+        <w:t>MAC_Before_After.png — 修正前后 MAC 对比图</w:t>
+      </w:r>
+    </w:p>
+    <w:p>
+      <w:pPr/>
+      <w:r>
         <w:t>现场操作要点（逐项打勾）：</w:t>
       </w:r>
     </w:p>
@@ -2605,6 +3993,32 @@
     <w:p>
       <w:pPr/>
       <w:r>
+        <w:t>【必存数据】（本步完成后必须存档的文件/文件夹，命名保持一致）</w:t>
+      </w:r>
+    </w:p>
+    <w:p>
+      <w:pPr>
+        <w:pStyle w:val="ListNumber"/>
+      </w:pPr>
+      <w:r>
+        <w:t>Unseal_Record.pdf — 盲验开封记录（见证签字，日期晚于 G3）</w:t>
+      </w:r>
+    </w:p>
+    <w:p>
+      <w:pPr/>
+      <w:r>
+        <w:t>【必存图片】（本步必须拍摄或导出的图，用于论文/答辩/追溯）</w:t>
+      </w:r>
+    </w:p>
+    <w:p>
+      <w:pPr/>
+      <w:r>
+        <w:t>本步无专用图片要求。</w:t>
+      </w:r>
+    </w:p>
+    <w:p>
+      <w:pPr/>
+      <w:r>
         <w:t>现场操作要点（逐项打勾）：</w:t>
       </w:r>
     </w:p>
@@ -2655,6 +4069,34 @@
     <w:p>
       <w:pPr/>
       <w:r>
+        <w:t>【必存数据】（本步完成后必须存档的文件/文件夹，命名保持一致）</w:t>
+      </w:r>
+    </w:p>
+    <w:p>
+      <w:pPr>
+        <w:pStyle w:val="ListNumber"/>
+      </w:pPr>
+      <w:r>
+        <w:t>Blind_Summary.csv — P10/P11/P12 各点 Updated/Baseline/Exp 对比</w:t>
+      </w:r>
+    </w:p>
+    <w:p>
+      <w:pPr/>
+      <w:r>
+        <w:t>【必存图片】（本步必须拍摄或导出的图，用于论文/答辩/追溯）</w:t>
+      </w:r>
+    </w:p>
+    <w:p>
+      <w:pPr>
+        <w:pStyle w:val="ListNumber"/>
+      </w:pPr>
+      <w:r>
+        <w:t>Blind_3Points_Summary.png — 三点盲验汇总图</w:t>
+      </w:r>
+    </w:p>
+    <w:p>
+      <w:pPr/>
+      <w:r>
         <w:t>现场操作要点（逐项打勾）：</w:t>
       </w:r>
     </w:p>
@@ -2705,6 +4147,34 @@
     <w:p>
       <w:pPr/>
       <w:r>
+        <w:t>【必存数据】（本步完成后必须存档的文件/文件夹，命名保持一致）</w:t>
+      </w:r>
+    </w:p>
+    <w:p>
+      <w:pPr>
+        <w:pStyle w:val="ListNumber"/>
+      </w:pPr>
+      <w:r>
+        <w:t>Blind_Summary_3points.csv — 通过率判定表（≥2/3 或 3/3）</w:t>
+      </w:r>
+    </w:p>
+    <w:p>
+      <w:pPr/>
+      <w:r>
+        <w:t>【必存图片】（本步必须拍摄或导出的图，用于论文/答辩/追溯）</w:t>
+      </w:r>
+    </w:p>
+    <w:p>
+      <w:pPr>
+        <w:pStyle w:val="ListNumber"/>
+      </w:pPr>
+      <w:r>
+        <w:t>Blind_Representative_FRF.png — 代表点 FRF 对比图</w:t>
+      </w:r>
+    </w:p>
+    <w:p>
+      <w:pPr/>
+      <w:r>
         <w:t>现场操作要点（逐项打勾）：</w:t>
       </w:r>
     </w:p>
@@ -2755,6 +4225,40 @@
     <w:p>
       <w:pPr/>
       <w:r>
+        <w:t>【必存数据】（本步完成后必须存档的文件/文件夹，命名保持一致）</w:t>
+      </w:r>
+    </w:p>
+    <w:p>
+      <w:pPr>
+        <w:pStyle w:val="ListNumber"/>
+      </w:pPr>
+      <w:r>
+        <w:t>Gate_G4.pdf — G4 门禁签字记录</w:t>
+      </w:r>
+    </w:p>
+    <w:p>
+      <w:pPr>
+        <w:pStyle w:val="ListNumber"/>
+      </w:pPr>
+      <w:r>
+        <w:t>Fail_Analysis.pdf — 若 fail：原因分析与回 D3 记录（禁用盲验数据）</w:t>
+      </w:r>
+    </w:p>
+    <w:p>
+      <w:pPr/>
+      <w:r>
+        <w:t>【必存图片】（本步必须拍摄或导出的图，用于论文/答辩/追溯）</w:t>
+      </w:r>
+    </w:p>
+    <w:p>
+      <w:pPr/>
+      <w:r>
+        <w:t>本步无专用图片要求。</w:t>
+      </w:r>
+    </w:p>
+    <w:p>
+      <w:pPr/>
+      <w:r>
         <w:t>现场操作要点（逐项打勾）：</w:t>
       </w:r>
     </w:p>
@@ -2813,6 +4317,32 @@
     <w:p>
       <w:pPr/>
       <w:r>
+        <w:t>【必存数据】（本步完成后必须存档的文件/文件夹，命名保持一致）</w:t>
+      </w:r>
+    </w:p>
+    <w:p>
+      <w:pPr>
+        <w:pStyle w:val="ListNumber"/>
+      </w:pPr>
+      <w:r>
+        <w:t>C1_Forward.csv — FE_Y_Extreme(θ*) 正推模态结果</w:t>
+      </w:r>
+    </w:p>
+    <w:p>
+      <w:pPr/>
+      <w:r>
+        <w:t>【必存图片】（本步必须拍摄或导出的图，用于论文/答辩/追溯）</w:t>
+      </w:r>
+    </w:p>
+    <w:p>
+      <w:pPr/>
+      <w:r>
+        <w:t>本步无专用图片要求。</w:t>
+      </w:r>
+    </w:p>
+    <w:p>
+      <w:pPr/>
+      <w:r>
         <w:t>现场操作要点（逐项打勾）：</w:t>
       </w:r>
     </w:p>
@@ -2857,7 +4387,29 @@
     <w:p>
       <w:pPr/>
       <w:r>
-        <w:t>必存：对比结论写入论文第 4–5 章 Limitation；数据对比表可并入 C1_Forward.csv。</w:t>
+        <w:t>【必存数据】（本步完成后必须存档的文件/文件夹，命名保持一致）</w:t>
+      </w:r>
+    </w:p>
+    <w:p>
+      <w:pPr>
+        <w:pStyle w:val="ListNumber"/>
+      </w:pPr>
+      <w:r>
+        <w:t>C1_Compare_Summary.csv — 正推 vs B2 raw 频率/MAC 对比表</w:t>
+      </w:r>
+    </w:p>
+    <w:p>
+      <w:pPr/>
+      <w:r>
+        <w:t>【必存图片】（本步必须拍摄或导出的图，用于论文/答辩/追溯）</w:t>
+      </w:r>
+    </w:p>
+    <w:p>
+      <w:pPr>
+        <w:pStyle w:val="ListNumber"/>
+      </w:pPr>
+      <w:r>
+        <w:t>C1_Compare_Chart.png — 构型验证对比图（误差大时仍须存）</w:t>
       </w:r>
     </w:p>
     <w:p>
@@ -2929,6 +4481,40 @@
     <w:p>
       <w:pPr/>
       <w:r>
+        <w:t>【必存数据】（本步完成后必须存档的文件/文件夹，命名保持一致）</w:t>
+      </w:r>
+    </w:p>
+    <w:p>
+      <w:pPr>
+        <w:pStyle w:val="ListNumber"/>
+      </w:pPr>
+      <w:r>
+        <w:t>Harmonic_Updated.csv — Updated(θ*) 谐响应 TP 输出</w:t>
+      </w:r>
+    </w:p>
+    <w:p>
+      <w:pPr>
+        <w:pStyle w:val="ListNumber"/>
+      </w:pPr>
+      <w:r>
+        <w:t>Harmonic_Baseline.csv — Baseline 谐响应 TP 输出</w:t>
+      </w:r>
+    </w:p>
+    <w:p>
+      <w:pPr/>
+      <w:r>
+        <w:t>【必存图片】（本步必须拍摄或导出的图，用于论文/答辩/追溯）</w:t>
+      </w:r>
+    </w:p>
+    <w:p>
+      <w:pPr/>
+      <w:r>
+        <w:t>本步无专用图片要求。</w:t>
+      </w:r>
+    </w:p>
+    <w:p>
+      <w:pPr/>
+      <w:r>
         <w:t>现场操作要点（逐项打勾）：</w:t>
       </w:r>
     </w:p>
@@ -2979,6 +4565,34 @@
     <w:p>
       <w:pPr/>
       <w:r>
+        <w:t>【必存数据】（本步完成后必须存档的文件/文件夹，命名保持一致）</w:t>
+      </w:r>
+    </w:p>
+    <w:p>
+      <w:pPr>
+        <w:pStyle w:val="ListNumber"/>
+      </w:pPr>
+      <w:r>
+        <w:t>Mode_Convergence.csv — 模态叠加阶次收敛记录</w:t>
+      </w:r>
+    </w:p>
+    <w:p>
+      <w:pPr/>
+      <w:r>
+        <w:t>【必存图片】（本步必须拍摄或导出的图，用于论文/答辩/追溯）</w:t>
+      </w:r>
+    </w:p>
+    <w:p>
+      <w:pPr>
+        <w:pStyle w:val="ListNumber"/>
+      </w:pPr>
+      <w:r>
+        <w:t>Mode_Superposition_Conv.png — 叠加收敛曲线（建议存）</w:t>
+      </w:r>
+    </w:p>
+    <w:p>
+      <w:pPr/>
+      <w:r>
         <w:t>现场操作要点（逐项打勾）：</w:t>
       </w:r>
     </w:p>
@@ -3037,6 +4651,34 @@
     <w:p>
       <w:pPr/>
       <w:r>
+        <w:t>【必存数据】（本步完成后必须存档的文件/文件夹，命名保持一致）</w:t>
+      </w:r>
+    </w:p>
+    <w:p>
+      <w:pPr>
+        <w:pStyle w:val="ListNumber"/>
+      </w:pPr>
+      <w:r>
+        <w:t>Added_Mass_Note.pdf — TP 加速计附加质量、安装位置、仿真等效说明</w:t>
+      </w:r>
+    </w:p>
+    <w:p>
+      <w:pPr/>
+      <w:r>
+        <w:t>【必存图片】（本步必须拍摄或导出的图，用于论文/答辩/追溯）</w:t>
+      </w:r>
+    </w:p>
+    <w:p>
+      <w:pPr>
+        <w:pStyle w:val="ListNumber"/>
+      </w:pPr>
+      <w:r>
+        <w:t>TP_Sensor_Photo.jpg — TP 传感器布置照片</w:t>
+      </w:r>
+    </w:p>
+    <w:p>
+      <w:pPr/>
+      <w:r>
         <w:t>现场操作要点（逐项打勾）：</w:t>
       </w:r>
     </w:p>
@@ -3087,6 +4729,40 @@
     <w:p>
       <w:pPr/>
       <w:r>
+        <w:t>【必存数据】（本步完成后必须存档的文件/文件夹，命名保持一致）</w:t>
+      </w:r>
+    </w:p>
+    <w:p>
+      <w:pPr>
+        <w:pStyle w:val="ListNumber"/>
+      </w:pPr>
+      <w:r>
+        <w:t>Force_Chain.pdf — 力链标定记录</w:t>
+      </w:r>
+    </w:p>
+    <w:p>
+      <w:pPr>
+        <w:pStyle w:val="ListNumber"/>
+      </w:pPr>
+      <w:r>
+        <w:t>Input_Force_Spectrum.csv — 输入力谱数据</w:t>
+      </w:r>
+    </w:p>
+    <w:p>
+      <w:pPr/>
+      <w:r>
+        <w:t>【必存图片】（本步必须拍摄或导出的图，用于论文/答辩/追溯）</w:t>
+      </w:r>
+    </w:p>
+    <w:p>
+      <w:pPr/>
+      <w:r>
+        <w:t>本步无专用图片要求。</w:t>
+      </w:r>
+    </w:p>
+    <w:p>
+      <w:pPr/>
+      <w:r>
         <w:t>现场操作要点（逐项打勾）：</w:t>
       </w:r>
     </w:p>
@@ -3137,6 +4813,34 @@
     <w:p>
       <w:pPr/>
       <w:r>
+        <w:t>【必存数据】（本步完成后必须存档的文件/文件夹，命名保持一致）</w:t>
+      </w:r>
+    </w:p>
+    <w:p>
+      <w:pPr>
+        <w:pStyle w:val="ListNumber"/>
+      </w:pPr>
+      <w:r>
+        <w:t>TP_FRF_5trials.csv — TP 谐响应 5 次重复 FRF 及 γ²</w:t>
+      </w:r>
+    </w:p>
+    <w:p>
+      <w:pPr/>
+      <w:r>
+        <w:t>【必存图片】（本步必须拍摄或导出的图，用于论文/答辩/追溯）</w:t>
+      </w:r>
+    </w:p>
+    <w:p>
+      <w:pPr>
+        <w:pStyle w:val="ListNumber"/>
+      </w:pPr>
+      <w:r>
+        <w:t>Coherence_Gamma2.png — 相干系数 γ² 图（建议存）</w:t>
+      </w:r>
+    </w:p>
+    <w:p>
+      <w:pPr/>
+      <w:r>
         <w:t>现场操作要点（逐项打勾）：</w:t>
       </w:r>
     </w:p>
@@ -3187,6 +4891,34 @@
     <w:p>
       <w:pPr/>
       <w:r>
+        <w:t>【必存数据】（本步完成后必须存档的文件/文件夹，命名保持一致）</w:t>
+      </w:r>
+    </w:p>
+    <w:p>
+      <w:pPr>
+        <w:pStyle w:val="ListNumber"/>
+      </w:pPr>
+      <w:r>
+        <w:t>Gate_G5.pdf — G5 门禁签字记录</w:t>
+      </w:r>
+    </w:p>
+    <w:p>
+      <w:pPr/>
+      <w:r>
+        <w:t>【必存图片】（本步必须拍摄或导出的图，用于论文/答辩/追溯）</w:t>
+      </w:r>
+    </w:p>
+    <w:p>
+      <w:pPr>
+        <w:pStyle w:val="ListNumber"/>
+      </w:pPr>
+      <w:r>
+        <w:t>Harmonic_FRF_3Lines.png — Updated/Baseline/Exp 三线 FRF 对比图</w:t>
+      </w:r>
+    </w:p>
+    <w:p>
+      <w:pPr/>
+      <w:r>
         <w:t>现场操作要点（逐项打勾）：</w:t>
       </w:r>
     </w:p>
@@ -3239,7 +4971,29 @@
     <w:p>
       <w:pPr/>
       <w:r>
-        <w:t>必存：Ch1-2.docx。必存图片：技术路线图。</w:t>
+        <w:t>【必存数据】（本步完成后必须存档的文件/文件夹，命名保持一致）</w:t>
+      </w:r>
+    </w:p>
+    <w:p>
+      <w:pPr>
+        <w:pStyle w:val="ListNumber"/>
+      </w:pPr>
+      <w:r>
+        <w:t>Ch1-2.docx — 第 1、2 章草稿（含创新点 3 条）</w:t>
+      </w:r>
+    </w:p>
+    <w:p>
+      <w:pPr/>
+      <w:r>
+        <w:t>【必存图片】（本步必须拍摄或导出的图，用于论文/答辩/追溯）</w:t>
+      </w:r>
+    </w:p>
+    <w:p>
+      <w:pPr>
+        <w:pStyle w:val="ListNumber"/>
+      </w:pPr>
+      <w:r>
+        <w:t>Tech_Roadmap.png — 技术路线图</w:t>
       </w:r>
     </w:p>
     <w:p>
@@ -3289,7 +5043,29 @@
     <w:p>
       <w:pPr/>
       <w:r>
-        <w:t>必存：Figure_Index.xlsx。必存图片：16+ 核心图。</w:t>
+        <w:t>【必存数据】（本步完成后必须存档的文件/文件夹，命名保持一致）</w:t>
+      </w:r>
+    </w:p>
+    <w:p>
+      <w:pPr>
+        <w:pStyle w:val="ListNumber"/>
+      </w:pPr>
+      <w:r>
+        <w:t>Figure_Index.xlsx — 图索引（图号、文件名、数据路径、生成脚本）</w:t>
+      </w:r>
+    </w:p>
+    <w:p>
+      <w:pPr/>
+      <w:r>
+        <w:t>【必存图片】（本步必须拍摄或导出的图，用于论文/答辩/追溯）</w:t>
+      </w:r>
+    </w:p>
+    <w:p>
+      <w:pPr>
+        <w:pStyle w:val="ListNumber"/>
+      </w:pPr>
+      <w:r>
+        <w:t>Core_Figures/ — 16+ 核心论文图（按 Figure_Index 命名）</w:t>
       </w:r>
     </w:p>
     <w:p>
@@ -3339,7 +5115,35 @@
     <w:p>
       <w:pPr/>
       <w:r>
-        <w:t>必存：Ch4-6.docx。</w:t>
+        <w:t>【必存数据】（本步完成后必须存档的文件/文件夹，命名保持一致）</w:t>
+      </w:r>
+    </w:p>
+    <w:p>
+      <w:pPr>
+        <w:pStyle w:val="ListNumber"/>
+      </w:pPr>
+      <w:r>
+        <w:t>Ch4-6.docx — 第 4–6 章</w:t>
+      </w:r>
+    </w:p>
+    <w:p>
+      <w:pPr>
+        <w:pStyle w:val="ListNumber"/>
+      </w:pPr>
+      <w:r>
+        <w:t>Appendix_A-D.pdf — 坐标/MAC/Trial/盲验程序附录</w:t>
+      </w:r>
+    </w:p>
+    <w:p>
+      <w:pPr/>
+      <w:r>
+        <w:t>【必存图片】（本步必须拍摄或导出的图，用于论文/答辩/追溯）</w:t>
+      </w:r>
+    </w:p>
+    <w:p>
+      <w:pPr/>
+      <w:r>
+        <w:t>本步无专用图片要求。</w:t>
       </w:r>
     </w:p>
     <w:p>
@@ -3389,6 +5193,40 @@
     <w:p>
       <w:pPr/>
       <w:r>
+        <w:t>【必存数据】（本步完成后必须存档的文件/文件夹，命名保持一致）</w:t>
+      </w:r>
+    </w:p>
+    <w:p>
+      <w:pPr>
+        <w:pStyle w:val="ListNumber"/>
+      </w:pPr>
+      <w:r>
+        <w:t>Symbols.docx — 符号表</w:t>
+      </w:r>
+    </w:p>
+    <w:p>
+      <w:pPr>
+        <w:pStyle w:val="ListNumber"/>
+      </w:pPr>
+      <w:r>
+        <w:t>References.bib — GB/T 7714 参考文献</w:t>
+      </w:r>
+    </w:p>
+    <w:p>
+      <w:pPr/>
+      <w:r>
+        <w:t>【必存图片】（本步必须拍摄或导出的图，用于论文/答辩/追溯）</w:t>
+      </w:r>
+    </w:p>
+    <w:p>
+      <w:pPr/>
+      <w:r>
+        <w:t>本步无专用图片要求。</w:t>
+      </w:r>
+    </w:p>
+    <w:p>
+      <w:pPr/>
+      <w:r>
         <w:t>现场操作要点（逐项打勾）：</w:t>
       </w:r>
     </w:p>
@@ -3433,6 +5271,34 @@
     <w:p>
       <w:pPr/>
       <w:r>
+        <w:t>【必存数据】（本步完成后必须存档的文件/文件夹，命名保持一致）</w:t>
+      </w:r>
+    </w:p>
+    <w:p>
+      <w:pPr>
+        <w:pStyle w:val="ListNumber"/>
+      </w:pPr>
+      <w:r>
+        <w:t>FE_Public/ — 脱敏 Public 版 FE 与可送审插图</w:t>
+      </w:r>
+    </w:p>
+    <w:p>
+      <w:pPr/>
+      <w:r>
+        <w:t>【必存图片】（本步必须拍摄或导出的图，用于论文/答辩/追溯）</w:t>
+      </w:r>
+    </w:p>
+    <w:p>
+      <w:pPr>
+        <w:pStyle w:val="ListNumber"/>
+      </w:pPr>
+      <w:r>
+        <w:t>Public_Figures/ — 涉密脱敏后的论文插图</w:t>
+      </w:r>
+    </w:p>
+    <w:p>
+      <w:pPr/>
+      <w:r>
         <w:t>现场操作要点（逐项打勾）：</w:t>
       </w:r>
     </w:p>
@@ -3477,6 +5343,32 @@
     <w:p>
       <w:pPr/>
       <w:r>
+        <w:t>【必存数据】（本步完成后必须存档的文件/文件夹，命名保持一致）</w:t>
+      </w:r>
+    </w:p>
+    <w:p>
+      <w:pPr>
+        <w:pStyle w:val="ListNumber"/>
+      </w:pPr>
+      <w:r>
+        <w:t>SCI_Outline.docx — 硕士论文与 SCI 章节划分规划</w:t>
+      </w:r>
+    </w:p>
+    <w:p>
+      <w:pPr/>
+      <w:r>
+        <w:t>【必存图片】（本步必须拍摄或导出的图，用于论文/答辩/追溯）</w:t>
+      </w:r>
+    </w:p>
+    <w:p>
+      <w:pPr/>
+      <w:r>
+        <w:t>本步无专用图片要求。</w:t>
+      </w:r>
+    </w:p>
+    <w:p>
+      <w:pPr/>
+      <w:r>
         <w:t>现场操作要点（逐项打勾）：</w:t>
       </w:r>
     </w:p>
@@ -3535,6 +5427,48 @@
     <w:p>
       <w:pPr/>
       <w:r>
+        <w:t>【必存数据】（本步完成后必须存档的文件/文件夹，命名保持一致）</w:t>
+      </w:r>
+    </w:p>
+    <w:p>
+      <w:pPr>
+        <w:pStyle w:val="ListNumber"/>
+      </w:pPr>
+      <w:r>
+        <w:t>04_SCI_Reserve/B1_raw/ — B1 隔离备份</w:t>
+      </w:r>
+    </w:p>
+    <w:p>
+      <w:pPr>
+        <w:pStyle w:val="ListNumber"/>
+      </w:pPr>
+      <w:r>
+        <w:t>04_SCI_Reserve/B2_raw/ — B2 隔离备份</w:t>
+      </w:r>
+    </w:p>
+    <w:p>
+      <w:pPr>
+        <w:pStyle w:val="ListNumber"/>
+      </w:pPr>
+      <w:r>
+        <w:t>04_SCI_Reserve/10start/ — 多初值优化备份</w:t>
+      </w:r>
+    </w:p>
+    <w:p>
+      <w:pPr/>
+      <w:r>
+        <w:t>【必存图片】（本步必须拍摄或导出的图，用于论文/答辩/追溯）</w:t>
+      </w:r>
+    </w:p>
+    <w:p>
+      <w:pPr/>
+      <w:r>
+        <w:t>本步无专用图片要求。</w:t>
+      </w:r>
+    </w:p>
+    <w:p>
+      <w:pPr/>
+      <w:r>
         <w:t>现场操作要点（逐项打勾）：</w:t>
       </w:r>
     </w:p>
@@ -3579,7 +5513,27 @@
     <w:p>
       <w:pPr/>
       <w:r>
-        <w:t>必存：02_Test_Raw/ 完整备份。</w:t>
+        <w:t>【必存数据】（本步完成后必须存档的文件/文件夹，命名保持一致）</w:t>
+      </w:r>
+    </w:p>
+    <w:p>
+      <w:pPr>
+        <w:pStyle w:val="ListNumber"/>
+      </w:pPr>
+      <w:r>
+        <w:t>02_Test_Raw/ — 全部 5 trial 原始数据（不可删 trial 4–5）</w:t>
+      </w:r>
+    </w:p>
+    <w:p>
+      <w:pPr/>
+      <w:r>
+        <w:t>【必存图片】（本步必须拍摄或导出的图，用于论文/答辩/追溯）</w:t>
+      </w:r>
+    </w:p>
+    <w:p>
+      <w:pPr/>
+      <w:r>
+        <w:t>本步无专用图片要求。</w:t>
       </w:r>
     </w:p>
     <w:p>
@@ -3624,6 +5578,48 @@
       <w:pPr/>
       <w:r>
         <w:t>EMA 交叉验证、C1 构型正推、三盲验详细汇总为 SCI 储备，硕士论文可精简表述，但原始数据必须在 B/C/E/F 阶段已采集完毕。不写 SCI 不等于可以不测。</w:t>
+      </w:r>
+    </w:p>
+    <w:p>
+      <w:pPr/>
+      <w:r>
+        <w:t>【必存数据】（本步完成后必须存档的文件/文件夹，命名保持一致）</w:t>
+      </w:r>
+    </w:p>
+    <w:p>
+      <w:pPr>
+        <w:pStyle w:val="ListNumber"/>
+      </w:pPr>
+      <w:r>
+        <w:t>SCI_EMA_Summary.csv — EMA 交叉验证汇总</w:t>
+      </w:r>
+    </w:p>
+    <w:p>
+      <w:pPr>
+        <w:pStyle w:val="ListNumber"/>
+      </w:pPr>
+      <w:r>
+        <w:t>SCI_C1_Summary.csv — C1 构型验证汇总</w:t>
+      </w:r>
+    </w:p>
+    <w:p>
+      <w:pPr>
+        <w:pStyle w:val="ListNumber"/>
+      </w:pPr>
+      <w:r>
+        <w:t>SCI_Blind_Detail.csv — 三盲验详细汇总</w:t>
+      </w:r>
+    </w:p>
+    <w:p>
+      <w:pPr/>
+      <w:r>
+        <w:t>【必存图片】（本步必须拍摄或导出的图，用于论文/答辩/追溯）</w:t>
+      </w:r>
+    </w:p>
+    <w:p>
+      <w:pPr/>
+      <w:r>
+        <w:t>本步无专用图片要求。</w:t>
       </w:r>
     </w:p>
     <w:p>

</xml_diff>